<commit_message>
feat(first-circuit): finish D. Me. FRCP base migration (fb-595.17.8)
Gate: run-1029063550-72333 1c7c38b1a9bdef6cfee364163a7e1570426e77c9
</commit_message>
<xml_diff>
--- a/courts/first-circuit/maine/federal/district/motion-brief/usage/OUTPUT-motion-brief.docx
+++ b/courts/first-circuit/maine/federal/district/motion-brief/usage/OUTPUT-motion-brief.docx
@@ -136,8 +136,8 @@
               <w:tblBorders>
                 <w:top w:val="nil"/>
                 <w:left w:val="nil"/>
-                <w:bottom w:val="single" w:sz="6" w:space="0" w:color="000000"/>
-                <w:right w:val="single" w:sz="6" w:space="0" w:color="000000"/>
+                <w:bottom w:val="nil"/>
+                <w:right w:val="nil"/>
               </w:tblBorders>
               <w:tblLayout w:type="fixed"/>
               <w:tblCellMar>

</xml_diff>